<commit_message>
CV cibles : chiffres cles et niveaux de langues
Co-Authored-By: Claude Opus 5.5 <noreply@anthropic.com>
</commit_message>
<xml_diff>
--- a/livrables/taff/2026-10-08_cv-cibles/cv-administratif-adv_moderne.docx
+++ b/livrables/taff/2026-10-08_cv-cibles/cv-administratif-adv_moderne.docx
@@ -196,7 +196,7 @@
               <w:rPr>
                 <w:color w:val="FFFFFF"/>
               </w:rPr>
-              <w:t>Relation clients et fournisseurs, négociation</w:t>
+              <w:t>Relation clients et fournisseurs</w:t>
             </w:r>
           </w:p>
           <w:p>
@@ -291,7 +291,7 @@
               <w:rPr>
                 <w:color w:val="FFFFFF"/>
               </w:rPr>
-              <w:t>Anglais, espagnol, portugais</w:t>
+              <w:t>Espagnol courant, anglais intermédiaire</w:t>
             </w:r>
           </w:p>
           <w:p>
@@ -309,7 +309,7 @@
                 <w:iCs/>
                 <w:color w:val="D9E2F3"/>
               </w:rPr>
-              <w:t>en perfectionnement</w:t>
+              <w:t>Portugais scolaire</w:t>
             </w:r>
           </w:p>
           <w:p>
@@ -555,7 +555,7 @@
                 <w:rFonts w:eastAsia="Times New Roman"/>
                 <w:color w:val="222222"/>
               </w:rPr>
-              <w:t>Organisation des plannings et gestion des emplois du temps de l'équipe</w:t>
+              <w:t>Organisation des plannings d’une équipe de 3 à 6 personnes, 2 à 3 chantiers en parallèle</w:t>
             </w:r>
           </w:p>
           <w:p>
@@ -576,7 +576,7 @@
                 <w:rFonts w:eastAsia="Times New Roman"/>
                 <w:color w:val="222222"/>
               </w:rPr>
-              <w:t>Formation des collaborateurs aux métiers de la résine</w:t>
+              <w:t>Formation aux métiers de la résine (environ 10 personnes par semaine pendant un an)</w:t>
             </w:r>
           </w:p>
           <w:p>
@@ -645,7 +645,7 @@
                 <w:rFonts w:eastAsia="Times New Roman"/>
                 <w:color w:val="222222"/>
               </w:rPr>
-              <w:t>Contrôle de conformité des réceptions et des expéditions</w:t>
+              <w:t>Contrôle de conformité des réceptions et des expéditions (2 à 7 palettes par jour)</w:t>
             </w:r>
           </w:p>
           <w:p>
@@ -666,7 +666,7 @@
                 <w:rFonts w:eastAsia="Times New Roman"/>
                 <w:color w:val="222222"/>
               </w:rPr>
-              <w:t>Suivi et mise à jour des stocks</w:t>
+              <w:t>Suivi des stocks de matières premières et d’emballages (10 à 12 références) sur Excel, pour un fabricant de glaces artisanales</w:t>
             </w:r>
           </w:p>
           <w:p>
@@ -735,7 +735,7 @@
                 <w:rFonts w:eastAsia="Times New Roman"/>
                 <w:color w:val="222222"/>
               </w:rPr>
-              <w:t>Création et gestion d'une entreprise pendant 6 ans</w:t>
+              <w:t>Création et gestion d’une entreprise pendant 6 ans (CA d’environ 100 000 € par an)</w:t>
             </w:r>
           </w:p>
           <w:p>
@@ -756,14 +756,7 @@
                 <w:rFonts w:eastAsia="Times New Roman"/>
                 <w:color w:val="222222"/>
               </w:rPr>
-              <w:t>É</w:t>
-            </w:r>
-            <w:r>
-              <w:rPr>
-                <w:rFonts w:eastAsia="Times New Roman"/>
-                <w:color w:val="222222"/>
-              </w:rPr>
-              <w:t>tablissement des devis et des factures, suivi des paiements</w:t>
+              <w:t>Établissement des devis et des factures, suivi des paiements</w:t>
             </w:r>
           </w:p>
           <w:p>
@@ -784,7 +777,7 @@
                 <w:rFonts w:eastAsia="Times New Roman"/>
                 <w:color w:val="222222"/>
               </w:rPr>
-              <w:t>Relation clientèle et négociation avec les fournisseurs</w:t>
+              <w:t>Relation clientèle et interface avec les fournisseurs, coordination de 2 à 3 sous-traitants</w:t>
             </w:r>
           </w:p>
           <w:p>
@@ -805,7 +798,7 @@
                 <w:rFonts w:eastAsia="Times New Roman"/>
                 <w:color w:val="222222"/>
               </w:rPr>
-              <w:t>Gestion administrative et suivi comptable</w:t>
+              <w:t>Suivi de la rentabilité des chantiers et de la situation financière, en lien avec l’expert-comptable</w:t>
             </w:r>
           </w:p>
           <w:p>
@@ -964,14 +957,7 @@
                 <w:rFonts w:eastAsia="Times New Roman"/>
                 <w:color w:val="222222"/>
               </w:rPr>
-              <w:t>Tests d'applications web et GPS embarqué</w:t>
-            </w:r>
-            <w:r>
-              <w:rPr>
-                <w:rFonts w:eastAsia="Times New Roman"/>
-                <w:color w:val="222222"/>
-              </w:rPr>
-              <w:t>es</w:t>
+              <w:t>Tests d'applications web et GPS embarquées</w:t>
             </w:r>
           </w:p>
           <w:p>

</xml_diff>